<commit_message>
fix(cv): sync CV skills list with live site
scripts/generate_cvs.py's SKILLS constant had drifted from index.html:
Frontend still listed Flexbox/CSS Grid (removed from the site pills),
React/Next.js under-described Axios, and Backend was missing the
"Pagination & Search" pill the site now shows. Aligned the script to
the site and regenerated both CV docx files plus the standard CV PDF
(soffice-verified, still 2 pages each).
</commit_message>
<xml_diff>
--- a/samiulAsumel.cv/Samiul_Alam_Sumel_CV.docx
+++ b/samiulAsumel.cv/Samiul_Alam_Sumel_CV.docx
@@ -213,7 +213,7 @@
           <w:color w:val="2A2A2A"/>
           <w:sz w:val="19"/>
         </w:rPr>
-        <w:t>HTML5 (Semantic), CSS3, Responsive Design, Flexbox, CSS Grid, Tailwind CSS, DaisyUI, JavaScript (ES6+), DOM &amp; Events, Fetch &amp; Promises, Async/Await, Array/Object Methods, ES Modules</w:t>
+        <w:t>HTML5 (Semantic), CSS3, Responsive Design, Tailwind CSS, DaisyUI, JavaScript (ES6+), DOM &amp; Events, Fetch &amp; Promises / Async-Await, Array/Object Methods, ES Modules</w:t>
       </w:r>
     </w:p>
     <w:p>
@@ -234,7 +234,7 @@
           <w:color w:val="2A2A2A"/>
           <w:sz w:val="19"/>
         </w:rPr>
-        <w:t>Own: React (Hooks, Context), React Router, React Hook Form. AI-assisted: TanStack Query, Axios, Next.js App Router, NextAuth</w:t>
+        <w:t>Own: React (Hooks, Context), React Router, React Hook Form. AI-assisted: TanStack Query, Axios (incl. Interceptors), Next.js App Router, NextAuth</w:t>
       </w:r>
     </w:p>
     <w:p>
@@ -255,7 +255,7 @@
           <w:color w:val="2A2A2A"/>
           <w:sz w:val="19"/>
         </w:rPr>
-        <w:t>Own: Git/GitHub, deployment (Cloudflare Pages/Firebase/Netlify). AI-assisted: Node.js/Express, REST APIs, MongoDB (Atlas), Aggregation Pipeline, JWT/Firebase Auth, Next.js API Routes, Stripe Payments</w:t>
+        <w:t>Own: Git &amp; GitHub (Branching, PRs), deployment (Cloudflare Pages/Firebase/Netlify). AI-assisted: Node.js &amp; Express, REST APIs (CRUD), MongoDB (Atlas), Aggregation Pipeline, JWT Auth, Firebase Auth &amp; Admin SDK, Next.js API Routes, Stripe Payments, Pagination &amp; Search</w:t>
       </w:r>
     </w:p>
     <w:p>

</xml_diff>

<commit_message>
feat(site): add Outreach Copilot and SalahSync projects
Found via a GitHub + Cloudflare dashboard sweep: both are newly
live-deployed repos not yet reflected on the site. Regenerated both
CVs (docx + pdf) and tightened CV spacing to hold the 2-page limit.
Excluded pts-sas and devops-command-summary from the same sweep --
they trip the site's RHCSA/DevOps/visa content bans.

Co-Authored-By: Claude Sonnet 5 <noreply@anthropic.com>
Claude-Session: https://claude.ai/code/session_01LMzRxz96ciyTSuormC6JTV
</commit_message>
<xml_diff>
--- a/samiulAsumel.cv/Samiul_Alam_Sumel_CV.docx
+++ b/samiulAsumel.cv/Samiul_Alam_Sumel_CV.docx
@@ -160,7 +160,7 @@
     </w:p>
     <w:p>
       <w:pPr>
-        <w:spacing w:before="180" w:after="60"/>
+        <w:spacing w:before="140" w:after="60"/>
         <w:pBdr>
           <w:bottom w:val="single" w:sz="6" w:space="2" w:color="B8862A"/>
         </w:pBdr>
@@ -281,7 +281,7 @@
     </w:p>
     <w:p>
       <w:pPr>
-        <w:spacing w:before="180" w:after="60"/>
+        <w:spacing w:before="140" w:after="60"/>
         <w:pBdr>
           <w:bottom w:val="single" w:sz="6" w:space="2" w:color="B8862A"/>
         </w:pBdr>
@@ -527,7 +527,7 @@
     </w:p>
     <w:p>
       <w:pPr>
-        <w:spacing w:before="180" w:after="60"/>
+        <w:spacing w:before="140" w:after="60"/>
         <w:pBdr>
           <w:bottom w:val="single" w:sz="6" w:space="2" w:color="B8862A"/>
         </w:pBdr>
@@ -543,7 +543,7 @@
     </w:p>
     <w:p>
       <w:pPr>
-        <w:spacing w:before="100" w:after="20"/>
+        <w:spacing w:before="80" w:after="20"/>
       </w:pPr>
       <w:r>
         <w:rPr>
@@ -620,7 +620,7 @@
     </w:p>
     <w:p>
       <w:pPr>
-        <w:spacing w:after="80" w:line="252" w:lineRule="auto"/>
+        <w:spacing w:after="60" w:line="252" w:lineRule="auto"/>
         <w:jc w:val="both"/>
       </w:pPr>
       <w:r>
@@ -634,7 +634,7 @@
     </w:p>
     <w:p>
       <w:pPr>
-        <w:spacing w:before="100" w:after="20"/>
+        <w:spacing w:before="80" w:after="20"/>
       </w:pPr>
       <w:r>
         <w:rPr>
@@ -711,7 +711,7 @@
     </w:p>
     <w:p>
       <w:pPr>
-        <w:spacing w:after="80" w:line="252" w:lineRule="auto"/>
+        <w:spacing w:after="60" w:line="252" w:lineRule="auto"/>
         <w:jc w:val="both"/>
       </w:pPr>
       <w:r>
@@ -725,7 +725,7 @@
     </w:p>
     <w:p>
       <w:pPr>
-        <w:spacing w:before="100" w:after="20"/>
+        <w:spacing w:before="80" w:after="20"/>
       </w:pPr>
       <w:r>
         <w:rPr>
@@ -802,7 +802,7 @@
     </w:p>
     <w:p>
       <w:pPr>
-        <w:spacing w:after="80" w:line="252" w:lineRule="auto"/>
+        <w:spacing w:after="60" w:line="252" w:lineRule="auto"/>
         <w:jc w:val="both"/>
       </w:pPr>
       <w:r>
@@ -816,7 +816,7 @@
     </w:p>
     <w:p>
       <w:pPr>
-        <w:spacing w:before="100" w:after="20"/>
+        <w:spacing w:before="80" w:after="20"/>
       </w:pPr>
       <w:r>
         <w:rPr>
@@ -893,7 +893,7 @@
     </w:p>
     <w:p>
       <w:pPr>
-        <w:spacing w:after="80" w:line="252" w:lineRule="auto"/>
+        <w:spacing w:after="60" w:line="252" w:lineRule="auto"/>
         <w:jc w:val="both"/>
       </w:pPr>
       <w:r>
@@ -907,7 +907,7 @@
     </w:p>
     <w:p>
       <w:pPr>
-        <w:spacing w:before="40" w:after="0" w:line="240" w:lineRule="auto"/>
+        <w:spacing w:before="20" w:after="0" w:line="240" w:lineRule="auto"/>
       </w:pPr>
       <w:r>
         <w:rPr>
@@ -956,7 +956,7 @@
     </w:p>
     <w:p>
       <w:pPr>
-        <w:spacing w:after="40" w:line="252" w:lineRule="auto"/>
+        <w:spacing w:after="20" w:line="252" w:lineRule="auto"/>
         <w:jc w:val="both"/>
       </w:pPr>
       <w:r>
@@ -970,7 +970,133 @@
     </w:p>
     <w:p>
       <w:pPr>
-        <w:spacing w:before="40" w:after="0" w:line="240" w:lineRule="auto"/>
+        <w:spacing w:before="20" w:after="0" w:line="240" w:lineRule="auto"/>
+      </w:pPr>
+      <w:r>
+        <w:rPr>
+          <w:b/>
+          <w:color w:val="1E3A5F"/>
+          <w:sz w:val="18"/>
+        </w:rPr>
+        <w:t>Outreach Copilot</w:t>
+      </w:r>
+      <w:r>
+        <w:rPr>
+          <w:color w:val="5A5A5A"/>
+          <w:sz w:val="16"/>
+        </w:rPr>
+        <w:t xml:space="preserve">   —   </w:t>
+      </w:r>
+      <w:hyperlink r:id="rId23">
+        <w:r>
+          <w:rPr>
+            <w:rFonts w:ascii="Calibri" w:hAnsi="Calibri"/>
+            <w:u w:val="single"/>
+            <w:color w:val="B8862A"/>
+            <w:sz w:val="16.4"/>
+          </w:rPr>
+          <w:t>Live</w:t>
+        </w:r>
+      </w:hyperlink>
+      <w:r>
+        <w:rPr>
+          <w:color w:val="5A5A5A"/>
+          <w:sz w:val="16"/>
+        </w:rPr>
+        <w:t xml:space="preserve">  |  </w:t>
+      </w:r>
+      <w:hyperlink r:id="rId24">
+        <w:r>
+          <w:rPr>
+            <w:rFonts w:ascii="Calibri" w:hAnsi="Calibri"/>
+            <w:u w:val="single"/>
+            <w:color w:val="B8862A"/>
+            <w:sz w:val="16.4"/>
+          </w:rPr>
+          <w:t>GitHub</w:t>
+        </w:r>
+      </w:hyperlink>
+    </w:p>
+    <w:p>
+      <w:pPr>
+        <w:spacing w:after="20" w:line="252" w:lineRule="auto"/>
+        <w:jc w:val="both"/>
+      </w:pPr>
+      <w:r>
+        <w:rPr>
+          <w:i w:val="0"/>
+          <w:color w:val="2A2A2A"/>
+          <w:sz w:val="17"/>
+        </w:rPr>
+        <w:t>Single-user AI-drafted cold-outreach tool — Cloudflare Pages + Workers API, D1-backed leads/analytics, Workers AI draft generation across email/LinkedIn/WhatsApp/cover letter; every send stays a manual, deliberate step.</w:t>
+      </w:r>
+    </w:p>
+    <w:p>
+      <w:pPr>
+        <w:spacing w:before="20" w:after="0" w:line="240" w:lineRule="auto"/>
+      </w:pPr>
+      <w:r>
+        <w:rPr>
+          <w:b/>
+          <w:color w:val="1E3A5F"/>
+          <w:sz w:val="18"/>
+        </w:rPr>
+        <w:t>SalahSync</w:t>
+      </w:r>
+      <w:r>
+        <w:rPr>
+          <w:color w:val="5A5A5A"/>
+          <w:sz w:val="16"/>
+        </w:rPr>
+        <w:t xml:space="preserve">   —   </w:t>
+      </w:r>
+      <w:hyperlink r:id="rId25">
+        <w:r>
+          <w:rPr>
+            <w:rFonts w:ascii="Calibri" w:hAnsi="Calibri"/>
+            <w:u w:val="single"/>
+            <w:color w:val="B8862A"/>
+            <w:sz w:val="16.4"/>
+          </w:rPr>
+          <w:t>Live</w:t>
+        </w:r>
+      </w:hyperlink>
+      <w:r>
+        <w:rPr>
+          <w:color w:val="5A5A5A"/>
+          <w:sz w:val="16"/>
+        </w:rPr>
+        <w:t xml:space="preserve">  |  </w:t>
+      </w:r>
+      <w:hyperlink r:id="rId26">
+        <w:r>
+          <w:rPr>
+            <w:rFonts w:ascii="Calibri" w:hAnsi="Calibri"/>
+            <w:u w:val="single"/>
+            <w:color w:val="B8862A"/>
+            <w:sz w:val="16.4"/>
+          </w:rPr>
+          <w:t>GitHub</w:t>
+        </w:r>
+      </w:hyperlink>
+    </w:p>
+    <w:p>
+      <w:pPr>
+        <w:spacing w:after="20" w:line="252" w:lineRule="auto"/>
+        <w:jc w:val="both"/>
+      </w:pPr>
+      <w:r>
+        <w:rPr>
+          <w:i w:val="0"/>
+          <w:color w:val="2A2A2A"/>
+          <w:sz w:val="17"/>
+        </w:rPr>
+        <w:t>Offline-first installable PWA that auto-generates a full daily prayer/routine schedule from Fajr time and office hours — offline solar prayer-time calculation, streak tracking, bilingual Bangla/English UI.</w:t>
+      </w:r>
+    </w:p>
+    <w:p>
+      <w:pPr>
+        <w:spacing w:before="20" w:after="0" w:line="240" w:lineRule="auto"/>
       </w:pPr>
       <w:r>
         <w:rPr>
@@ -995,7 +1121,7 @@
         </w:rPr>
         <w:t xml:space="preserve">   —   </w:t>
       </w:r>
-      <w:hyperlink r:id="rId23">
+      <w:hyperlink r:id="rId27">
         <w:r>
           <w:rPr>
             <w:rFonts w:ascii="Calibri" w:hAnsi="Calibri"/>
@@ -1009,7 +1135,7 @@
     </w:p>
     <w:p>
       <w:pPr>
-        <w:spacing w:after="40" w:line="252" w:lineRule="auto"/>
+        <w:spacing w:after="20" w:line="252" w:lineRule="auto"/>
         <w:jc w:val="both"/>
       </w:pPr>
       <w:r>
@@ -1053,7 +1179,7 @@
     </w:p>
     <w:p>
       <w:pPr>
-        <w:spacing w:before="180" w:after="60"/>
+        <w:spacing w:before="140" w:after="60"/>
         <w:pBdr>
           <w:bottom w:val="single" w:sz="6" w:space="2" w:color="B8862A"/>
         </w:pBdr>
@@ -1121,7 +1247,7 @@
     </w:p>
     <w:p>
       <w:pPr>
-        <w:spacing w:before="180" w:after="60"/>
+        <w:spacing w:before="140" w:after="60"/>
         <w:pBdr>
           <w:bottom w:val="single" w:sz="6" w:space="2" w:color="B8862A"/>
         </w:pBdr>
@@ -1200,7 +1326,7 @@
     </w:p>
     <w:sectPr>
       <w:pgSz w:w="12240" w:h="15840"/>
-      <w:pgMar w:top="461" w:right="792" w:bottom="360" w:left="792" w:header="720" w:footer="720" w:gutter="0"/>
+      <w:pgMar w:top="403" w:right="749" w:bottom="288" w:left="749" w:header="720" w:footer="720" w:gutter="0"/>
       <w:cols w:space="720"/>
       <w:docGrid w:linePitch="360"/>
     </w:sectPr>

</xml_diff>

<commit_message>
feat(site): detail requirement-first workflow and process automation
Expand the site and both CVs to describe how engagements actually work:
talking to the people doing the work, writing the requirement down, and
finding the manual step in a running process to automate — not just
"finds a problem and builds it". Adds a Manual Process Automation service,
a 4th How I Build principle, and removes the #domain line implying every
project is self-sourced (contradicted the new requirement-first framing).

Co-Authored-By: Claude Sonnet 5 <noreply@anthropic.com>
Claude-Session: https://claude.ai/code/session_01AJ9VJfCUdQ4Zdbjy8uk34w
</commit_message>
<xml_diff>
--- a/samiulAsumel.cv/Samiul_Alam_Sumel_CV.docx
+++ b/samiulAsumel.cv/Samiul_Alam_Sumel_CV.docx
@@ -155,7 +155,7 @@
           <w:color w:val="2A2A2A"/>
           <w:sz w:val="18"/>
         </w:rPr>
-        <w:t>AI Product Engineer with 12+ years of hands-on experience in cargo billing, vessel/vehicle tracking, and port authority workflows at Mongla Port Authority. Finds the operational problem, designs the system, builds it with AI-assisted development, then rebuilds each piece independently from memory before counting it as learned. 3 self-built tools — billing, vehicle tracking, payroll automation — are in daily production use. Skills backed by that shipped software and self-directed study (The Odin Project, Full Stack Open), not a bootcamp certificate. Builds frontend independently; backend/data work with AI-assisted development (Claude Code), closed through a self-authored engineering roadmap. Not a bootcamp graduate or senior engineer, but bringing 12+ years of professional discipline from a demanding operational job. Seeking a remote AI Product Engineer, Port Operations Technologist, Logistics Systems Engineer, or full-stack role, worldwide, with no time zone constraints.</w:t>
+        <w:t>AI Product Engineer with 12+ years of hands-on experience in cargo billing, vessel/vehicle tracking, and port authority workflows at Mongla Port Authority. Works requirement-first — finds the manual step in a process, designs the system, builds it with AI-assisted development, then rebuilds each piece independently from memory before counting it as learned. 3 self-built tools — billing, vehicle tracking, payroll automation — are in daily production use. Skills backed by that shipped software and self-directed study (The Odin Project, Full Stack Open), not a bootcamp certificate. Builds frontend independently; backend/data work with AI-assisted development (Claude Code), closed through a self-authored engineering roadmap. Not a bootcamp graduate or senior engineer, but bringing 12+ years of professional discipline from a demanding operational job. Seeking a remote AI Product Engineer, Port Operations Technologist, Logistics Systems Engineer, or full-stack role, worldwide, with no time zone constraints.</w:t>
       </w:r>
     </w:p>
     <w:p>
@@ -424,7 +424,7 @@
           <w:color w:val="2A2A2A"/>
           <w:sz w:val="18"/>
         </w:rPr>
-        <w:t>Independently identified critical inefficiencies in manual paper-based billing, overtime payroll calculation, and vehicle tracking workflows — designed and deployed 3 live web applications now used daily by C&amp;F agents and port staff, built with plain JavaScript/HTML/CSS and AI-assisted development as a productivity tool.</w:t>
+        <w:t>Talked to the billing desk, Traffic Department, and C&amp;F agents to find the manual bottleneck in each workflow — then designed and deployed 3 live web applications now used daily by C&amp;F agents and port staff, built with plain JavaScript/HTML/CSS and AI-assisted development as a productivity tool.</w:t>
       </w:r>
     </w:p>
     <w:p>

</xml_diff>